<commit_message>
deleted:    docs/Eurorack/305-Analogue-Stochastic-Signal-Generators/Files/~$5-Rev.1.docx 	deleted:    docs/Eurorack/308-Voltage-Controlled-Filter-And-Wavefolder/Files/~$8-Rev.1.docx 	new file:   docs/Eurorack/311-Digital-Audio-Player/Files/manual.docx 	new file:   docs/Eurorack/311-Digital-Audio-Player/Manual.md 	new file:   docs/Eurorack/311-Digital-Audio-Player/index.md 	modified:   mkdocs.yml
</commit_message>
<xml_diff>
--- a/docs/Eurorack/305-Analogue-Stochastic-Signal-Generators/Files/305-Rev.1.docx
+++ b/docs/Eurorack/305-Analogue-Stochastic-Signal-Generators/Files/305-Rev.1.docx
@@ -866,6 +866,17 @@
                 <w:lang w:val="en-US"/>
               </w:rPr>
             </w:pPr>
+            <w:r>
+              <w:rPr>
+                <w:rFonts w:ascii="Times New Roman" w:hAnsi="Times New Roman" w:cs="Times New Roman"/>
+                <w:b w:val="0"/>
+                <w:bCs w:val="0"/>
+                <w:i/>
+                <w:iCs/>
+                <w:lang w:val="en-US"/>
+              </w:rPr>
+              <w:t>10hp</w:t>
+            </w:r>
           </w:p>
         </w:tc>
         <w:tc>

</xml_diff>